<commit_message>
getting ready for q2
</commit_message>
<xml_diff>
--- a/course-files/quizzes/q1_glossary_compact.docx
+++ b/course-files/quizzes/q1_glossary_compact.docx
@@ -1508,15 +1508,7 @@
           <w:b/>
           <w:sz w:val="22"/>
         </w:rPr>
-        <w:t>&lt;</w:t>
-      </w:r>
-      <w:r>
-        <w:rPr>
-          <w:rFonts w:ascii="Arial" w:hAnsi="Arial" w:cs="Arial"/>
-          <w:b/>
-          <w:sz w:val="22"/>
-        </w:rPr>
-        <w:t>=</w:t>
+        <w:t>&lt;=</w:t>
       </w:r>
       <w:r>
         <w:rPr>
@@ -4289,6 +4281,189 @@
           <w:sz w:val="22"/>
         </w:rPr>
         <w:t xml:space="preserve"> is the empty list, it throws an exception.</w:t>
+      </w:r>
+    </w:p>
+    <w:p>
+      <w:pPr>
+        <w:rPr>
+          <w:rFonts w:ascii="Arial" w:hAnsi="Arial"/>
+          <w:sz w:val="22"/>
+        </w:rPr>
+      </w:pPr>
+    </w:p>
+    <w:p>
+      <w:pPr>
+        <w:rPr>
+          <w:rFonts w:ascii="Arial" w:hAnsi="Arial"/>
+          <w:sz w:val="22"/>
+        </w:rPr>
+      </w:pPr>
+      <w:r>
+        <w:rPr>
+          <w:rFonts w:ascii="Arial" w:hAnsi="Arial"/>
+          <w:sz w:val="22"/>
+        </w:rPr>
+        <w:t>(</w:t>
+      </w:r>
+      <w:r>
+        <w:rPr>
+          <w:rFonts w:ascii="Arial" w:hAnsi="Arial"/>
+          <w:b/>
+          <w:sz w:val="22"/>
+        </w:rPr>
+        <w:t>cons</w:t>
+      </w:r>
+      <w:r>
+        <w:rPr>
+          <w:rFonts w:ascii="Arial" w:hAnsi="Arial"/>
+          <w:sz w:val="22"/>
+        </w:rPr>
+        <w:t xml:space="preserve"> </w:t>
+      </w:r>
+      <w:proofErr w:type="gramStart"/>
+      <w:r>
+        <w:rPr>
+          <w:rFonts w:ascii="Arial" w:hAnsi="Arial"/>
+          <w:i/>
+          <w:sz w:val="22"/>
+        </w:rPr>
+        <w:t>element  list</w:t>
+      </w:r>
+      <w:proofErr w:type="gramEnd"/>
+      <w:r>
+        <w:rPr>
+          <w:rFonts w:ascii="Arial" w:hAnsi="Arial"/>
+          <w:sz w:val="22"/>
+        </w:rPr>
+        <w:t>)</w:t>
+      </w:r>
+    </w:p>
+    <w:p>
+      <w:pPr>
+        <w:rPr>
+          <w:sz w:val="22"/>
+        </w:rPr>
+      </w:pPr>
+      <m:oMathPara>
+        <m:oMathParaPr>
+          <m:jc m:val="left"/>
+        </m:oMathParaPr>
+        <m:oMath>
+          <m:r>
+            <w:rPr>
+              <w:rFonts w:ascii="Cambria Math" w:hAnsi="Cambria Math"/>
+              <w:sz w:val="22"/>
+            </w:rPr>
+            <m:t>X  (listof X)→(listof X)</m:t>
+          </m:r>
+          <m:r>
+            <m:rPr>
+              <m:sty m:val="p"/>
+            </m:rPr>
+            <w:rPr>
+              <w:sz w:val="22"/>
+            </w:rPr>
+            <w:br/>
+          </m:r>
+        </m:oMath>
+      </m:oMathPara>
+      <w:r>
+        <w:rPr>
+          <w:sz w:val="22"/>
+        </w:rPr>
+        <w:t xml:space="preserve">Returns a new list starting with </w:t>
+      </w:r>
+      <w:r>
+        <w:rPr>
+          <w:i/>
+          <w:sz w:val="22"/>
+        </w:rPr>
+        <w:t>element</w:t>
+      </w:r>
+      <w:r>
+        <w:rPr>
+          <w:sz w:val="22"/>
+        </w:rPr>
+        <w:t xml:space="preserve">, and followed by all the elements of </w:t>
+      </w:r>
+      <w:r>
+        <w:rPr>
+          <w:i/>
+          <w:sz w:val="22"/>
+        </w:rPr>
+        <w:t>list</w:t>
+      </w:r>
+      <w:r>
+        <w:rPr>
+          <w:sz w:val="22"/>
+        </w:rPr>
+        <w:t xml:space="preserve">, in order.  Thus </w:t>
+      </w:r>
+      <w:r>
+        <w:rPr>
+          <w:sz w:val="22"/>
+        </w:rPr>
+        <w:t>(</w:t>
+      </w:r>
+      <w:r>
+        <w:rPr>
+          <w:sz w:val="22"/>
+        </w:rPr>
+        <w:t xml:space="preserve">cons 1 </w:t>
+      </w:r>
+      <w:r>
+        <w:rPr>
+          <w:sz w:val="22"/>
+        </w:rPr>
+        <w:t>(</w:t>
+      </w:r>
+      <w:r>
+        <w:rPr>
+          <w:sz w:val="22"/>
+        </w:rPr>
+        <w:t>list 0 0</w:t>
+      </w:r>
+      <w:r>
+        <w:rPr>
+          <w:sz w:val="22"/>
+        </w:rPr>
+        <w:t>))</w:t>
+      </w:r>
+      <w:r>
+        <w:rPr>
+          <w:sz w:val="22"/>
+        </w:rPr>
+        <w:t xml:space="preserve"> returns the list: </w:t>
+      </w:r>
+      <w:r>
+        <w:rPr>
+          <w:sz w:val="22"/>
+        </w:rPr>
+        <w:t>‘</w:t>
+      </w:r>
+      <w:r>
+        <w:rPr>
+          <w:sz w:val="22"/>
+        </w:rPr>
+        <w:t>(</w:t>
+      </w:r>
+      <w:r>
+        <w:rPr>
+          <w:sz w:val="22"/>
+        </w:rPr>
+        <w:t>1 0 0</w:t>
+      </w:r>
+      <w:r>
+        <w:rPr>
+          <w:sz w:val="22"/>
+        </w:rPr>
+        <w:t>)</w:t>
+      </w:r>
+      <w:r>
+        <w:rPr>
+          <w:sz w:val="22"/>
+        </w:rPr>
+        <w:t>.</w:t>
       </w:r>
     </w:p>
     <w:p>

</xml_diff>